<commit_message>
feat(pchsmb): add 2026 CBA rules, transport cart specs, and photo assets to Sideline Screen D26
- Add official 2026 CBA Marching Band Competition & Prop Rules extraction to Appendix A (with Falcon Stadium renovation clearance note)
- Add Transport Cart (Component 2) specification to Appendix B: backdrop-compatible chassis, side guide rails, and latching retention gates
- Update Field Operations in Appendix A: trailer transit, sideline cart staging, unfolding/folding workflow, and continuous movement exit
- Mandate double-bagged secondary containment for ballasting
- Embed hero photo in README.md and add approved photo derivatives
- Reorganize 3D models and CAD files into Hardware/ directory
- Omit in-development Cart Gate Latch FCStd model via .gitignore
</commit_message>
<xml_diff>
--- a/PCHSMB/_Sideline Screen/docs/Sideline_Screen_Duck_Blind_Build_Instructions.docx
+++ b/PCHSMB/_Sideline Screen/docs/Sideline_Screen_Duck_Blind_Build_Instructions.docx
@@ -343,6 +343,52 @@
           </w:p>
         </w:tc>
       </w:tr>
+      <w:tr>
+        <w:tc>
+          <w:tcPr>
+            <w:tcW w:w="1200" w:type="dxa"/>
+            <w:vAlign w:val="center"/>
+          </w:tcPr>
+          <w:p>
+            <w:r>
+              <w:t>D26</w:t>
+            </w:r>
+          </w:p>
+        </w:tc>
+        <w:tc>
+          <w:tcPr>
+            <w:tcW w:w="1600" w:type="dxa"/>
+            <w:vAlign w:val="center"/>
+          </w:tcPr>
+          <w:p>
+            <w:r>
+              <w:t>2026-09-01</w:t>
+            </w:r>
+          </w:p>
+        </w:tc>
+        <w:tc>
+          <w:tcPr>
+            <w:tcW w:w="2200" w:type="dxa"/>
+            <w:vAlign w:val="center"/>
+          </w:tcPr>
+          <w:p>
+            <w:r>
+              <w:t>Working draft</w:t>
+            </w:r>
+          </w:p>
+        </w:tc>
+        <w:tc>
+          <w:tcPr>
+            <w:tcW w:w="4360" w:type="dxa"/>
+            <w:vAlign w:val="center"/>
+          </w:tcPr>
+          <w:p>
+            <w:r>
+              <w:t>Added 2026 CBA competition prop rules, transport cart specifications with side rails and latching gates, and updated index</w:t>
+            </w:r>
+          </w:p>
+        </w:tc>
+      </w:tr>
     </w:tbl>
     <w:p>
       <w:pPr>
@@ -571,7 +617,7 @@
         <w:pStyle w:val="AppendixCoverMetadata"/>
       </w:pPr>
       <w:r>
-        <w:t>Parent revision: Release v0 (unreleased) | Development build D25 | September 1, 2026</w:t>
+        <w:t>Parent revision: Release v0 (unreleased) | Development build D26 | September 1, 2026</w:t>
       </w:r>
     </w:p>
     <w:p>
@@ -662,7 +708,7 @@
     </w:p>
     <w:p>
       <w:r>
-        <w:t>This subsection will cover releasing the hinged arm clips, folding the rear frame and support arms, protecting the vinyl and printed parts during transport, carrying points, stacking, and storage.</w:t>
+        <w:t>To prepare sideline screens for transport, handlers release the hinged arm clips, fold the bottom support arms (E) upward against the rear frame, and collapse the entire rear support frame flat against the main frame. Multiple folded screens are loaded vertically onto a dedicated rolling transport cart (see Appendix B, Section 5) between side guide rails. Front and rear retaining gates are closed and latched (Cart Gate Latch) to lock screens in place during transit from the equipment trailer to the stadium entrance.</w:t>
       </w:r>
     </w:p>
     <w:p>
@@ -671,12 +717,12 @@
         <w:keepNext/>
       </w:pPr>
       <w:r>
-        <w:t>Deployment</w:t>
+        <w:t>Deployment and Sideline Cart Stowage</w:t>
       </w:r>
     </w:p>
     <w:p>
       <w:r>
-        <w:t>This subsection will cover site inspection, unfolding sequence, clip engagement, orientation to the audience and field, minimum crew requirements, and the pre-use inspection.</w:t>
+        <w:t>At the performance field gate, the transport cart is rolled to the sideline staging position. Handlers unlatch and open the front and back cart gates, lift individual folded screens from the cart bed, and carry them to their designated sideline coordinates. Once on coordinate, operators swing the rear support frame open and snap the hinged arm clips securely over the bottom support arms (E). During the performance, the empty transport cart remains parked and braked along the sideline outside the performance boundary. Immediately upon the final performance cue, screens are collapsed flat, rapidly reloaded into the transport cart, gates latched, and the cart rolled off the field in continuous movement per Rule 8.05.</w:t>
       </w:r>
     </w:p>
     <w:p>
@@ -726,6 +772,272 @@
         <w:keepNext/>
       </w:pPr>
       <w:r>
+        <w:t>Applicable 2026 Marching Band Competition &amp; Prop Rules</w:t>
+      </w:r>
+    </w:p>
+    <w:p>
+      <w:r>
+        <w:t>The following governing rules are extracted directly from the official 2026 Colorado Bandmasters Association (CBA) Marching Band Rulebook (Appendix B Index [11]). All prop builders, parent crew, and student field operators must adhere to these standards:</w:t>
+      </w:r>
+    </w:p>
+    <w:p>
+      <w:pPr>
+        <w:spacing w:before="80" w:after="160" w:line="276" w:lineRule="auto"/>
+        <w:shd w:val="clear" w:fill="F4F6F9"/>
+        <w:pBdr>
+          <w:top w:val="single" w:sz="6" w:space="6" w:color="D7DBE2"/>
+          <w:left w:val="single" w:sz="6" w:space="6" w:color="D7DBE2"/>
+          <w:bottom w:val="single" w:sz="6" w:space="6" w:color="D7DBE2"/>
+          <w:right w:val="single" w:sz="6" w:space="6" w:color="D7DBE2"/>
+        </w:pBdr>
+      </w:pPr>
+      <w:r>
+        <w:rPr>
+          <w:rFonts w:ascii="Calibri" w:hAnsi="Calibri"/>
+          <w:b/>
+          <w:color w:val="1F4D78"/>
+        </w:rPr>
+        <w:t xml:space="preserve">ANNUAL RULEBOOK NOTICE: </w:t>
+      </w:r>
+      <w:r>
+        <w:rPr>
+          <w:rFonts w:ascii="Calibri" w:hAnsi="Calibri"/>
+          <w:color w:val="1F4D78"/>
+        </w:rPr>
+        <w:t>This section reflects the governing rules for the 2026 competitive season. Logistics staff and build leads must review this section annually against updated CBA and Bands of America (BOA) rulebooks to verify continuing compliance.</w:t>
+      </w:r>
+    </w:p>
+    <w:p>
+      <w:pPr>
+        <w:pStyle w:val="Heading3"/>
+        <w:keepNext/>
+      </w:pPr>
+      <w:r>
+        <w:t>Rule 8.05: Props, Equipment, Surface Protection, and Double-Bagging</w:t>
+      </w:r>
+    </w:p>
+    <w:p>
+      <w:pPr>
+        <w:spacing w:before="40" w:after="40"/>
+        <w:ind w:left="720" w:hanging="360"/>
+      </w:pPr>
+      <w:r>
+        <w:t xml:space="preserve">• </w:t>
+      </w:r>
+      <w:r>
+        <w:rPr>
+          <w:b/>
+        </w:rPr>
+        <w:t xml:space="preserve">Gate Ingress: </w:t>
+      </w:r>
+      <w:r>
+        <w:t>All props and equipment must be designed and of a quantity such that they can be brought onto the Performance Field from the band entrance gate.</w:t>
+      </w:r>
+    </w:p>
+    <w:p>
+      <w:pPr>
+        <w:spacing w:before="40" w:after="40"/>
+        <w:ind w:left="720" w:hanging="360"/>
+      </w:pPr>
+      <w:r>
+        <w:t xml:space="preserve">• </w:t>
+      </w:r>
+      <w:r>
+        <w:rPr>
+          <w:b/>
+        </w:rPr>
+        <w:t xml:space="preserve">Continuous Movement: </w:t>
+      </w:r>
+      <w:r>
+        <w:t>Following the end of the band's Performance, all props and equipment must be in continuous movement until entirely removed from the stadium.</w:t>
+      </w:r>
+    </w:p>
+    <w:p>
+      <w:pPr>
+        <w:spacing w:before="40" w:after="40"/>
+        <w:ind w:left="720" w:hanging="360"/>
+      </w:pPr>
+      <w:r>
+        <w:t xml:space="preserve">• </w:t>
+      </w:r>
+      <w:r>
+        <w:rPr>
+          <w:b/>
+        </w:rPr>
+        <w:t xml:space="preserve">Turf Contact Protection: </w:t>
+      </w:r>
+      <w:r>
+        <w:t>All wooden props must be protected with a heavy-duty sustainable plastic product (PVC, Melamine, etc.) where said prop comes in contact with the field surface. Steel props with smooth edges are acceptable without the need for additional protection.</w:t>
+      </w:r>
+    </w:p>
+    <w:p>
+      <w:pPr>
+        <w:spacing w:before="40" w:after="40"/>
+        <w:ind w:left="720" w:hanging="360"/>
+      </w:pPr>
+      <w:r>
+        <w:t xml:space="preserve">• </w:t>
+      </w:r>
+      <w:r>
+        <w:rPr>
+          <w:b/>
+        </w:rPr>
+        <w:t xml:space="preserve">Secondary Containment for Sandbags: </w:t>
+      </w:r>
+      <w:r>
+        <w:t>Props must not leave holes in the Performance Field surface. Sand bags must be in a secondary container (bucket, double bagged, etc.) that will prevent sand from leaking.</w:t>
+      </w:r>
+    </w:p>
+    <w:p>
+      <w:pPr>
+        <w:pStyle w:val="Heading3"/>
+        <w:keepNext/>
+      </w:pPr>
+      <w:r>
+        <w:t>Rule 8.07: Equipment Wheel and Turf Protection Standards</w:t>
+      </w:r>
+    </w:p>
+    <w:p>
+      <w:pPr>
+        <w:spacing w:before="40" w:after="40"/>
+        <w:ind w:left="720" w:hanging="360"/>
+      </w:pPr>
+      <w:r>
+        <w:t xml:space="preserve">• </w:t>
+      </w:r>
+      <w:r>
+        <w:rPr>
+          <w:b/>
+        </w:rPr>
+        <w:t xml:space="preserve">Pneumatic-Like Tires: </w:t>
+      </w:r>
+      <w:r>
+        <w:t>All instruments and equipment wheeled into the stadium from the entrance gate forward must have pneumatic-like tires. Wheels must be able to support the weight of the instrument/prop without creating damage to the field surface.</w:t>
+      </w:r>
+    </w:p>
+    <w:p>
+      <w:pPr>
+        <w:pStyle w:val="Heading3"/>
+        <w:keepNext/>
+      </w:pPr>
+      <w:r>
+        <w:t>Rule 8.08: Prop Staging Height Restrictions</w:t>
+      </w:r>
+    </w:p>
+    <w:p>
+      <w:pPr>
+        <w:spacing w:before="40" w:after="40"/>
+        <w:ind w:left="720" w:hanging="360"/>
+      </w:pPr>
+      <w:r>
+        <w:t xml:space="preserve">• </w:t>
+      </w:r>
+      <w:r>
+        <w:rPr>
+          <w:b/>
+        </w:rPr>
+        <w:t xml:space="preserve">12-Foot Rigid Height Limit: </w:t>
+      </w:r>
+      <w:r>
+        <w:t>Staging (props, backdrops, screens, or similar objects) built and/or used by bands at CBA sanctioned events shall be limited to a maximum total height of twelve (12) feet, including wheels, platforms, and safety railings. Materials such as wood, metal, plastic, or aluminum are not permitted above the twelve-foot limit. (Note: The Sideline Screen is a nominal 4 ft height when deployed, safely conforming to this rule).</w:t>
+      </w:r>
+    </w:p>
+    <w:p>
+      <w:pPr>
+        <w:pStyle w:val="Heading3"/>
+        <w:keepNext/>
+      </w:pPr>
+      <w:r>
+        <w:t>Rule 8.09: Prop Assembly, Timing, and USAFA Falcon Stadium Clearance</w:t>
+      </w:r>
+    </w:p>
+    <w:p>
+      <w:pPr>
+        <w:spacing w:before="40" w:after="40"/>
+        <w:ind w:left="720" w:hanging="360"/>
+      </w:pPr>
+      <w:r>
+        <w:t xml:space="preserve">• </w:t>
+      </w:r>
+      <w:r>
+        <w:rPr>
+          <w:b/>
+        </w:rPr>
+        <w:t xml:space="preserve">Staging Ingress: </w:t>
+      </w:r>
+      <w:r>
+        <w:t>A band may bring props into the stadium after the previous band has entered the field. Props must fit in the end zone curve without blocking entrance/exit gates.</w:t>
+      </w:r>
+    </w:p>
+    <w:p>
+      <w:pPr>
+        <w:spacing w:before="40" w:after="40"/>
+        <w:ind w:left="720" w:hanging="360"/>
+      </w:pPr>
+      <w:r>
+        <w:t xml:space="preserve">• </w:t>
+      </w:r>
+      <w:r>
+        <w:rPr>
+          <w:b/>
+        </w:rPr>
+        <w:t xml:space="preserve">Falcon Stadium 9'6" Tunnel Rule: </w:t>
+      </w:r>
+      <w:r>
+        <w:t>Any prop being used at Falcon Stadium (United States Air Force Academy) must not exceed 9 ft 6 in. to clear the tunnel entrance. Props up to the 12-ft limit may be erected in the tunnel after clearing the initial entrance.</w:t>
+      </w:r>
+    </w:p>
+    <w:p>
+      <w:pPr>
+        <w:spacing w:before="40" w:after="40"/>
+        <w:ind w:left="720" w:hanging="360"/>
+      </w:pPr>
+      <w:r>
+        <w:t xml:space="preserve">• </w:t>
+      </w:r>
+      <w:r>
+        <w:rPr>
+          <w:b/>
+        </w:rPr>
+        <w:t xml:space="preserve">Falcon Stadium Venue Update (2025/2026): </w:t>
+      </w:r>
+      <w:r>
+        <w:t>While the 9'6" tunnel restriction remains in the printed CBA rulebook, it has been rendered obsolete by stadium renovations completed prior to the 2025 season. The lower overhead crossbeam at the bottom of the Falcon Stadium tunnel was permanently removed, allowing props to clear without restriction.</w:t>
+      </w:r>
+    </w:p>
+    <w:p>
+      <w:pPr>
+        <w:pStyle w:val="Heading3"/>
+        <w:keepNext/>
+      </w:pPr>
+      <w:r>
+        <w:t>Rule 9.07: Parent Field Access &amp; Wristband Limits</w:t>
+      </w:r>
+    </w:p>
+    <w:p>
+      <w:pPr>
+        <w:spacing w:before="40" w:after="40"/>
+        <w:ind w:left="720" w:hanging="360"/>
+      </w:pPr>
+      <w:r>
+        <w:t xml:space="preserve">• </w:t>
+      </w:r>
+      <w:r>
+        <w:rPr>
+          <w:b/>
+        </w:rPr>
+        <w:t xml:space="preserve">25 Field Pass Wristbands: </w:t>
+      </w:r>
+      <w:r>
+        <w:t>Access to the field is restricted to Directors/Staff with CBA passes and parents assisting with props/front ensemble with designated Field Pass wristbands. Each band receives exactly 25 Field Pass wristbands upon check-in. Additional wristbands are not available.</w:t>
+      </w:r>
+    </w:p>
+    <w:p>
+      <w:pPr>
+        <w:pStyle w:val="Heading2"/>
+        <w:keepNext/>
+      </w:pPr>
+      <w:r>
         <w:t>Post-use inspection and storage</w:t>
       </w:r>
     </w:p>
@@ -838,7 +1150,7 @@
         <w:pStyle w:val="AppendixCoverMetadata"/>
       </w:pPr>
       <w:r>
-        <w:t>Parent revision: Release v0 (unreleased) | Development build D25 | September 1, 2026</w:t>
+        <w:t>Parent revision: Release v0 (unreleased) | Development build D26 | September 1, 2026</w:t>
       </w:r>
     </w:p>
     <w:p>
@@ -5055,6 +5367,93 @@
     </w:p>
     <w:p>
       <w:pPr>
+        <w:pStyle w:val="Heading2"/>
+        <w:keepNext/>
+        <w:pageBreakBefore/>
+      </w:pPr>
+      <w:r>
+        <w:t>Transport Cart Fabrication (Planned Component)</w:t>
+      </w:r>
+    </w:p>
+    <w:p>
+      <w:r>
+        <w:t>To support efficient field transport and rapid deployment during competitive shows, a dedicated rolling transport cart will be constructed to hold multiple folded sideline screens / duck blinds:</w:t>
+      </w:r>
+    </w:p>
+    <w:p>
+      <w:pPr>
+        <w:spacing w:before="40" w:after="40"/>
+        <w:ind w:left="720" w:hanging="360"/>
+      </w:pPr>
+      <w:r>
+        <w:t xml:space="preserve">• </w:t>
+      </w:r>
+      <w:r>
+        <w:rPr>
+          <w:b/>
+        </w:rPr>
+        <w:t xml:space="preserve">Backdrop Cart Base Compatibility: </w:t>
+      </w:r>
+      <w:r>
+        <w:t>The transport cart utilizes the same heavy-duty 96.0 in. x 44.5 in. 2x4 lumber base framing, 1/2-in. plywood decking, and four heavy-duty swivel plate casters standardized for the Rolling Backdrop System. Building on this shared chassis ensures dimensional consistency and uniform trailer nose wall loading.</w:t>
+      </w:r>
+    </w:p>
+    <w:p>
+      <w:pPr>
+        <w:spacing w:before="40" w:after="40"/>
+        <w:ind w:left="720" w:hanging="360"/>
+      </w:pPr>
+      <w:r>
+        <w:t xml:space="preserve">• </w:t>
+      </w:r>
+      <w:r>
+        <w:rPr>
+          <w:b/>
+        </w:rPr>
+        <w:t xml:space="preserve">Side Guide Rails: </w:t>
+      </w:r>
+      <w:r>
+        <w:t>Vertical guide rails are mounted along both the left and right longitudinal edges of the cart bed to contain folded sideline screens standing upright in parallel slots during rolling transit.</w:t>
+      </w:r>
+    </w:p>
+    <w:p>
+      <w:pPr>
+        <w:spacing w:before="40" w:after="40"/>
+        <w:ind w:left="720" w:hanging="360"/>
+      </w:pPr>
+      <w:r>
+        <w:t xml:space="preserve">• </w:t>
+      </w:r>
+      <w:r>
+        <w:rPr>
+          <w:b/>
+        </w:rPr>
+        <w:t xml:space="preserve">Front &amp; Rear Latching Gates: </w:t>
+      </w:r>
+      <w:r>
+        <w:t>Hinged retention gates are installed across the front and rear openings of the cart. The gates are secured with 3D-printed Cart Gate Latches (Cart Gate Latch.FCStd) to lock screens firmly inside the cart bed while allowing quick release and unobstructed unloading at the field sideline.</w:t>
+      </w:r>
+    </w:p>
+    <w:p>
+      <w:pPr>
+        <w:spacing w:before="40" w:after="40"/>
+        <w:ind w:left="720" w:hanging="360"/>
+      </w:pPr>
+      <w:r>
+        <w:t xml:space="preserve">• </w:t>
+      </w:r>
+      <w:r>
+        <w:rPr>
+          <w:b/>
+        </w:rPr>
+        <w:t xml:space="preserve">Status: </w:t>
+      </w:r>
+      <w:r>
+        <w:t>Provisional design specification. Detailed CAD models, cut lists, and fastener schedules for the transport cart modifications will be finalized in subsequent build releases following prototype testing.</w:t>
+      </w:r>
+    </w:p>
+    <w:p>
+      <w:pPr>
         <w:pStyle w:val="Heading1"/>
         <w:keepNext/>
         <w:pageBreakBefore/>
@@ -5567,6 +5966,44 @@
       <w:cols w:space="720"/>
       <w:docGrid w:linePitch="360"/>
     </w:sectPr>
+    <w:p>
+      <w:pPr>
+        <w:pStyle w:val="IndexSourceEntry"/>
+      </w:pPr>
+      <w:r>
+        <w:rPr>
+          <w:rFonts w:ascii="Calibri" w:hAnsi="Calibri"/>
+          <w:b/>
+          <w:color w:val="1F4D78"/>
+          <w:sz w:val="21"/>
+        </w:rPr>
+        <w:t xml:space="preserve">[11] </w:t>
+      </w:r>
+      <w:hyperlink r:id="rId49" w:history="1">
+        <w:r>
+          <w:rPr>
+            <w:rFonts w:ascii="Calibri" w:hAnsi="Calibri"/>
+            <w:color w:val="0563C1"/>
+            <w:u w:val="single"/>
+            <w:sz w:val="21"/>
+          </w:rPr>
+          <w:t>2026 Colorado Bandmasters Association (CBA) Marching Band Rulebook (PDF)</w:t>
+        </w:r>
+      </w:hyperlink>
+    </w:p>
+    <w:p>
+      <w:pPr>
+        <w:pStyle w:val="IndexURL"/>
+      </w:pPr>
+      <w:r>
+        <w:rPr>
+          <w:rFonts w:ascii="Calibri" w:hAnsi="Calibri"/>
+          <w:color w:val="666666"/>
+          <w:sz w:val="17"/>
+        </w:rPr>
+        <w:t>https://ebf5c7e8-3869-4325-bd98-ce10f57d7545.filesusr.com/ugd/83f67e_cb5fe6efdbdb4ce98f619580f694bc94.pdf</w:t>
+      </w:r>
+    </w:p>
   </w:body>
 </w:document>
 </file>
@@ -5585,7 +6022,7 @@
         <w:color w:val="666666"/>
         <w:sz w:val="17"/>
       </w:rPr>
-      <w:t xml:space="preserve">Development build D25 | Page </w:t>
+      <w:t xml:space="preserve">Development build D26 | Page </w:t>
     </w:r>
     <w:r>
       <w:rPr>
@@ -5616,7 +6053,7 @@
         <w:color w:val="666666"/>
         <w:sz w:val="17"/>
       </w:rPr>
-      <w:t xml:space="preserve">Development build D25 | Page </w:t>
+      <w:t xml:space="preserve">Development build D26 | Page </w:t>
     </w:r>
     <w:r>
       <w:rPr>
@@ -5658,7 +6095,7 @@
         <w:color w:val="666666"/>
         <w:sz w:val="18"/>
       </w:rPr>
-      <w:t xml:space="preserve">Development build D25 | Overview | Page </w:t>
+      <w:t xml:space="preserve">Development build D26 | Overview | Page </w:t>
     </w:r>
     <w:r>
       <w:fldChar w:fldCharType="begin"/>
@@ -5693,7 +6130,7 @@
         <w:color w:val="666666"/>
         <w:sz w:val="18"/>
       </w:rPr>
-      <w:t xml:space="preserve">Development build D25 | Overview | Page </w:t>
+      <w:t xml:space="preserve">Development build D26 | Overview | Page </w:t>
     </w:r>
     <w:r>
       <w:fldChar w:fldCharType="begin"/>
@@ -5728,7 +6165,7 @@
         <w:color w:val="666666"/>
         <w:sz w:val="18"/>
       </w:rPr>
-      <w:t>Development build D25 | Appendix A | Page A-</w:t>
+      <w:t>Development build D26 | Appendix A | Page A-</w:t>
     </w:r>
     <w:r>
       <w:fldChar w:fldCharType="begin"/>
@@ -5763,7 +6200,7 @@
         <w:color w:val="666666"/>
         <w:sz w:val="18"/>
       </w:rPr>
-      <w:t>Development build D25 | Appendix B | Page B-</w:t>
+      <w:t>Development build D26 | Appendix B | Page B-</w:t>
     </w:r>
     <w:r>
       <w:fldChar w:fldCharType="begin"/>

</xml_diff>